<commit_message>
fix(aac-performance-review-audit): Format Rejection Template uses [Direct], not a sample name
The canonical template carried "Mireya's" in the opener and the Core Message
form. Both now read "[Direct]'s". TEMPLATE_MD5 updated to 0bac36e6 so the
builder accepts the new file.
</commit_message>
<xml_diff>
--- a/aac-skills/aac-performance-review-audit/Format Rejection Template.docx
+++ b/aac-skills/aac-performance-review-audit/Format Rejection Template.docx
@@ -29,7 +29,7 @@
           <w:sz w:val="22"/>
           <w:szCs w:val="22"/>
         </w:rPr>
-        <w:t>This is a good draft. The examples have dates, the Guidance is in your own voice, and everything from Mireya's self-appraisal shows up somewhere in the review. However, you did not follow our standards:</w:t>
+        <w:t>This is a good draft. The examples have dates, the Guidance is in your own voice, and everything from [Direct]’s self-appraisal shows up somewhere in the review. However, you did not follow our standards:</w:t>
       </w:r>
     </w:p>
     <w:p>
@@ -515,7 +515,7 @@
           <w:sz w:val="22"/>
           <w:szCs w:val="22"/>
         </w:rPr>
-        <w:t>Form: "Mireya's results have (exceeded expectations)/(met expectations)/(not met expectations) since she started with us on 7/28/2025. I am recommending she (is ready for promotion to X)/(is ready for vertical growth in her role, in the areas of X)/(is ready for horizontal growth in her role, in the areas of X)/(maintain her current role and responsibilities at this time)."</w:t>
+        <w:t>Form: "[Direct]’s results have (exceeded expectations)/(met expectations)/(not met expectations) since she started with us on 7/28/2025. I am recommending she (is ready for promotion to X)/(is ready for vertical growth in her role, in the areas of X)/(is ready for horizontal growth in her role, in the areas of X)/(maintain her current role and responsibilities at this time)."</w:t>
       </w:r>
     </w:p>
     <w:p>

</xml_diff>